<commit_message>
docs(healthcare): add Sample/Test Document Set section to Revenue Recovery manual + suite-hub link
- Manual: new subsection under Healthcare (Section 5) documenting the 6
  synthetic sample PDFs in html/healthcare/, with file/contents/notes
  table and a Verified box noting the real end-to-end test (File2 +
  File4 through routes/doc-router.js pdf-parse extraction ->
  server/healthcare/hc-neural-intake.js classifyIntake(), both routed
  to billing at high confidence).
- suite-hub.html: added a link from the Healthcare card to
  ANOMALY_ANSWER_KEY.md so the sample/test doc set is discoverable
  from the hub, same as the manual.
</commit_message>
<xml_diff>
--- a/html/operations/TSM_Document_Processing_Revenue_Recovery_Manual_v2.0.docx
+++ b/html/operations/TSM_Document_Processing_Revenue_Recovery_Manual_v2.0.docx
@@ -7020,6 +7020,598 @@
                 <w:szCs w:val="20"/>
               </w:rPr>
               <w:t xml:space="preserve">Denials and appeals are the core revenue-recovery loop for Healthcare — every day a denial sits unappealed is a day closer to the payer's appeal-window deadline.</w:t>
+            </w:r>
+          </w:p>
+        </w:tc>
+      </w:tr>
+    </w:tbl>
+    <w:p>
+      <w:pPr>
+        <w:pStyle w:val="Heading3"/>
+        <w:spacing w:after="100" w:before="200"/>
+      </w:pPr>
+      <w:r>
+        <w:rPr>
+          <w:b/>
+          <w:bCs/>
+          <w:color w:val="C0392B"/>
+          <w:sz w:val="22"/>
+          <w:szCs w:val="22"/>
+        </w:rPr>
+        <w:t xml:space="preserve">Sample / Test Document Set</w:t>
+      </w:r>
+    </w:p>
+    <w:p>
+      <w:pPr>
+        <w:spacing w:after="160"/>
+      </w:pPr>
+      <w:r>
+        <w:rPr>
+          <w:i w:val="false"/>
+          <w:iCs w:val="false"/>
+          <w:color w:val="1A1A1A"/>
+          <w:sz w:val="21"/>
+          <w:szCs w:val="21"/>
+        </w:rPr>
+        <w:t xml:space="preserve">Six synthetic sample PDFs live at html/healthcare/ — two-page pairs covering all four Healthcare document types (prior auth request, denial, remittance, EOB) across three fictional payers. They exist for testing the intake pipeline and for demos, and are safe to use freely: every name, ID, and dollar figure is fictional and each page is watermarked SAMPLE / SYNTHETIC DATA.</w:t>
+      </w:r>
+    </w:p>
+    <w:tbl>
+      <w:tblPr>
+        <w:tblW w:type="dxa" w:w="9600"/>
+        <w:tblBorders>
+          <w:top w:val="single" w:color="auto" w:sz="4"/>
+          <w:left w:val="single" w:color="auto" w:sz="4"/>
+          <w:bottom w:val="single" w:color="auto" w:sz="4"/>
+          <w:right w:val="single" w:color="auto" w:sz="4"/>
+          <w:insideH w:val="single" w:color="auto" w:sz="4"/>
+          <w:insideV w:val="single" w:color="auto" w:sz="4"/>
+        </w:tblBorders>
+      </w:tblPr>
+      <w:tblGrid>
+        <w:gridCol w:w="2100"/>
+        <w:gridCol w:w="3300"/>
+        <w:gridCol w:w="4200"/>
+      </w:tblGrid>
+      <w:tr>
+        <w:trPr>
+          <w:tblHeader/>
+        </w:trPr>
+        <w:tc>
+          <w:tcPr>
+            <w:tcW w:type="dxa" w:w="2100"/>
+            <w:shd w:fill="1B2A4A" w:val="clear"/>
+            <w:tcMar>
+              <w:top w:type="dxa" w:w="80"/>
+              <w:left w:type="dxa" w:w="120"/>
+              <w:bottom w:type="dxa" w:w="80"/>
+              <w:right w:type="dxa" w:w="120"/>
+            </w:tcMar>
+          </w:tcPr>
+          <w:p>
+            <w:r>
+              <w:rPr>
+                <w:b/>
+                <w:bCs/>
+                <w:color w:val="FFFFFF"/>
+                <w:sz w:val="18"/>
+                <w:szCs w:val="18"/>
+              </w:rPr>
+              <w:t xml:space="preserve">File</w:t>
+            </w:r>
+          </w:p>
+        </w:tc>
+        <w:tc>
+          <w:tcPr>
+            <w:tcW w:type="dxa" w:w="3300"/>
+            <w:shd w:fill="1B2A4A" w:val="clear"/>
+            <w:tcMar>
+              <w:top w:type="dxa" w:w="80"/>
+              <w:left w:type="dxa" w:w="120"/>
+              <w:bottom w:type="dxa" w:w="80"/>
+              <w:right w:type="dxa" w:w="120"/>
+            </w:tcMar>
+          </w:tcPr>
+          <w:p>
+            <w:r>
+              <w:rPr>
+                <w:b/>
+                <w:bCs/>
+                <w:color w:val="FFFFFF"/>
+                <w:sz w:val="18"/>
+                <w:szCs w:val="18"/>
+              </w:rPr>
+              <w:t xml:space="preserve">Contents</w:t>
+            </w:r>
+          </w:p>
+        </w:tc>
+        <w:tc>
+          <w:tcPr>
+            <w:tcW w:type="dxa" w:w="4200"/>
+            <w:shd w:fill="1B2A4A" w:val="clear"/>
+            <w:tcMar>
+              <w:top w:type="dxa" w:w="80"/>
+              <w:left w:type="dxa" w:w="120"/>
+              <w:bottom w:type="dxa" w:w="80"/>
+              <w:right w:type="dxa" w:w="120"/>
+            </w:tcMar>
+          </w:tcPr>
+          <w:p>
+            <w:r>
+              <w:rPr>
+                <w:b/>
+                <w:bCs/>
+                <w:color w:val="FFFFFF"/>
+                <w:sz w:val="18"/>
+                <w:szCs w:val="18"/>
+              </w:rPr>
+              <w:t xml:space="preserve">Notes</w:t>
+            </w:r>
+          </w:p>
+        </w:tc>
+      </w:tr>
+      <w:tr>
+        <w:tc>
+          <w:tcPr>
+            <w:tcW w:type="dxa" w:w="2100"/>
+            <w:tcMar>
+              <w:top w:type="dxa" w:w="80"/>
+              <w:left w:type="dxa" w:w="120"/>
+              <w:bottom w:type="dxa" w:w="80"/>
+              <w:right w:type="dxa" w:w="120"/>
+            </w:tcMar>
+          </w:tcPr>
+          <w:p>
+            <w:r>
+              <w:rPr>
+                <w:color w:val="1A1A1A"/>
+                <w:sz w:val="18"/>
+                <w:szCs w:val="18"/>
+              </w:rPr>
+              <w:t xml:space="preserve">File1_PriorAuth_Denial.pdf</w:t>
+            </w:r>
+          </w:p>
+        </w:tc>
+        <w:tc>
+          <w:tcPr>
+            <w:tcW w:type="dxa" w:w="3300"/>
+            <w:tcMar>
+              <w:top w:type="dxa" w:w="80"/>
+              <w:left w:type="dxa" w:w="120"/>
+              <w:bottom w:type="dxa" w:w="80"/>
+              <w:right w:type="dxa" w:w="120"/>
+            </w:tcMar>
+          </w:tcPr>
+          <w:p>
+            <w:r>
+              <w:rPr>
+                <w:color w:val="1A1A1A"/>
+                <w:sz w:val="18"/>
+                <w:szCs w:val="18"/>
+              </w:rPr>
+              <w:t xml:space="preserve">Prior Auth Request + Denial Letter (Meridian Health Plan)</w:t>
+            </w:r>
+          </w:p>
+        </w:tc>
+        <w:tc>
+          <w:tcPr>
+            <w:tcW w:type="dxa" w:w="4200"/>
+            <w:tcMar>
+              <w:top w:type="dxa" w:w="80"/>
+              <w:left w:type="dxa" w:w="120"/>
+              <w:bottom w:type="dxa" w:w="80"/>
+              <w:right w:type="dxa" w:w="120"/>
+            </w:tcMar>
+          </w:tcPr>
+          <w:p>
+            <w:r>
+              <w:rPr>
+                <w:color w:val="1A1A1A"/>
+                <w:sz w:val="18"/>
+                <w:szCs w:val="18"/>
+              </w:rPr>
+              <w:t xml:space="preserve">Clean baseline, but reuses the same claim # as File2 for a different service — see below.</w:t>
+            </w:r>
+          </w:p>
+        </w:tc>
+      </w:tr>
+      <w:tr>
+        <w:tc>
+          <w:tcPr>
+            <w:tcW w:type="dxa" w:w="2100"/>
+            <w:tcMar>
+              <w:top w:type="dxa" w:w="80"/>
+              <w:left w:type="dxa" w:w="120"/>
+              <w:bottom w:type="dxa" w:w="80"/>
+              <w:right w:type="dxa" w:w="120"/>
+            </w:tcMar>
+          </w:tcPr>
+          <w:p>
+            <w:r>
+              <w:rPr>
+                <w:color w:val="1A1A1A"/>
+                <w:sz w:val="18"/>
+                <w:szCs w:val="18"/>
+              </w:rPr>
+              <w:t xml:space="preserve">File2_Remittance_EOB.pdf</w:t>
+            </w:r>
+          </w:p>
+        </w:tc>
+        <w:tc>
+          <w:tcPr>
+            <w:tcW w:type="dxa" w:w="3300"/>
+            <w:tcMar>
+              <w:top w:type="dxa" w:w="80"/>
+              <w:left w:type="dxa" w:w="120"/>
+              <w:bottom w:type="dxa" w:w="80"/>
+              <w:right w:type="dxa" w:w="120"/>
+            </w:tcMar>
+          </w:tcPr>
+          <w:p>
+            <w:r>
+              <w:rPr>
+                <w:color w:val="1A1A1A"/>
+                <w:sz w:val="18"/>
+                <w:szCs w:val="18"/>
+              </w:rPr>
+              <w:t xml:space="preserve">Remittance Advice + EOB (Meridian Health Plan)</w:t>
+            </w:r>
+          </w:p>
+        </w:tc>
+        <w:tc>
+          <w:tcPr>
+            <w:tcW w:type="dxa" w:w="4200"/>
+            <w:tcMar>
+              <w:top w:type="dxa" w:w="80"/>
+              <w:left w:type="dxa" w:w="120"/>
+              <w:bottom w:type="dxa" w:w="80"/>
+              <w:right w:type="dxa" w:w="120"/>
+            </w:tcMar>
+          </w:tcPr>
+          <w:p>
+            <w:r>
+              <w:rPr>
+                <w:color w:val="1A1A1A"/>
+                <w:sz w:val="18"/>
+                <w:szCs w:val="18"/>
+              </w:rPr>
+              <w:t xml:space="preserve">Carries an accidental $0.05 rounding mismatch between line-item detail and the stated total; left in intentionally as a lower-stakes test case.</w:t>
+            </w:r>
+          </w:p>
+        </w:tc>
+      </w:tr>
+      <w:tr>
+        <w:tc>
+          <w:tcPr>
+            <w:tcW w:type="dxa" w:w="2100"/>
+            <w:tcMar>
+              <w:top w:type="dxa" w:w="80"/>
+              <w:left w:type="dxa" w:w="120"/>
+              <w:bottom w:type="dxa" w:w="80"/>
+              <w:right w:type="dxa" w:w="120"/>
+            </w:tcMar>
+          </w:tcPr>
+          <w:p>
+            <w:r>
+              <w:rPr>
+                <w:color w:val="1A1A1A"/>
+                <w:sz w:val="18"/>
+                <w:szCs w:val="18"/>
+              </w:rPr>
+              <w:t xml:space="preserve">File3_PriorAuth_Denial_CO197.pdf</w:t>
+            </w:r>
+          </w:p>
+        </w:tc>
+        <w:tc>
+          <w:tcPr>
+            <w:tcW w:type="dxa" w:w="3300"/>
+            <w:tcMar>
+              <w:top w:type="dxa" w:w="80"/>
+              <w:left w:type="dxa" w:w="120"/>
+              <w:bottom w:type="dxa" w:w="80"/>
+              <w:right w:type="dxa" w:w="120"/>
+            </w:tcMar>
+          </w:tcPr>
+          <w:p>
+            <w:r>
+              <w:rPr>
+                <w:color w:val="1A1A1A"/>
+                <w:sz w:val="18"/>
+                <w:szCs w:val="18"/>
+              </w:rPr>
+              <w:t xml:space="preserve">Prior Auth Request + Denial Letter (Arizona Health Network, CO-197 precert absent)</w:t>
+            </w:r>
+          </w:p>
+        </w:tc>
+        <w:tc>
+          <w:tcPr>
+            <w:tcW w:type="dxa" w:w="4200"/>
+            <w:tcMar>
+              <w:top w:type="dxa" w:w="80"/>
+              <w:left w:type="dxa" w:w="120"/>
+              <w:bottom w:type="dxa" w:w="80"/>
+              <w:right w:type="dxa" w:w="120"/>
+            </w:tcMar>
+          </w:tcPr>
+          <w:p>
+            <w:r>
+              <w:rPr>
+                <w:color w:val="1A1A1A"/>
+                <w:sz w:val="18"/>
+                <w:szCs w:val="18"/>
+              </w:rPr>
+              <w:t xml:space="preserve">Clean baseline.</w:t>
+            </w:r>
+          </w:p>
+        </w:tc>
+      </w:tr>
+      <w:tr>
+        <w:tc>
+          <w:tcPr>
+            <w:tcW w:type="dxa" w:w="2100"/>
+            <w:tcMar>
+              <w:top w:type="dxa" w:w="80"/>
+              <w:left w:type="dxa" w:w="120"/>
+              <w:bottom w:type="dxa" w:w="80"/>
+              <w:right w:type="dxa" w:w="120"/>
+            </w:tcMar>
+          </w:tcPr>
+          <w:p>
+            <w:r>
+              <w:rPr>
+                <w:color w:val="1A1A1A"/>
+                <w:sz w:val="18"/>
+                <w:szCs w:val="18"/>
+              </w:rPr>
+              <w:t xml:space="preserve">File4_Remittance_EOB_2.pdf</w:t>
+            </w:r>
+          </w:p>
+        </w:tc>
+        <w:tc>
+          <w:tcPr>
+            <w:tcW w:type="dxa" w:w="3300"/>
+            <w:tcMar>
+              <w:top w:type="dxa" w:w="80"/>
+              <w:left w:type="dxa" w:w="120"/>
+              <w:bottom w:type="dxa" w:w="80"/>
+              <w:right w:type="dxa" w:w="120"/>
+            </w:tcMar>
+          </w:tcPr>
+          <w:p>
+            <w:r>
+              <w:rPr>
+                <w:color w:val="1A1A1A"/>
+                <w:sz w:val="18"/>
+                <w:szCs w:val="18"/>
+              </w:rPr>
+              <w:t xml:space="preserve">Remittance Advice + EOB (Arizona Health Network)</w:t>
+            </w:r>
+          </w:p>
+        </w:tc>
+        <w:tc>
+          <w:tcPr>
+            <w:tcW w:type="dxa" w:w="4200"/>
+            <w:tcMar>
+              <w:top w:type="dxa" w:w="80"/>
+              <w:left w:type="dxa" w:w="120"/>
+              <w:bottom w:type="dxa" w:w="80"/>
+              <w:right w:type="dxa" w:w="120"/>
+            </w:tcMar>
+          </w:tcPr>
+          <w:p>
+            <w:r>
+              <w:rPr>
+                <w:color w:val="1A1A1A"/>
+                <w:sz w:val="18"/>
+                <w:szCs w:val="18"/>
+              </w:rPr>
+              <w:t xml:space="preserve">Clean baseline.</w:t>
+            </w:r>
+          </w:p>
+        </w:tc>
+      </w:tr>
+      <w:tr>
+        <w:tc>
+          <w:tcPr>
+            <w:tcW w:type="dxa" w:w="2100"/>
+            <w:tcMar>
+              <w:top w:type="dxa" w:w="80"/>
+              <w:left w:type="dxa" w:w="120"/>
+              <w:bottom w:type="dxa" w:w="80"/>
+              <w:right w:type="dxa" w:w="120"/>
+            </w:tcMar>
+          </w:tcPr>
+          <w:p>
+            <w:r>
+              <w:rPr>
+                <w:color w:val="1A1A1A"/>
+                <w:sz w:val="18"/>
+                <w:szCs w:val="18"/>
+              </w:rPr>
+              <w:t xml:space="preserve">File5_PriorAuth_Denial_ANOMALY.pdf</w:t>
+            </w:r>
+          </w:p>
+        </w:tc>
+        <w:tc>
+          <w:tcPr>
+            <w:tcW w:type="dxa" w:w="3300"/>
+            <w:tcMar>
+              <w:top w:type="dxa" w:w="80"/>
+              <w:left w:type="dxa" w:w="120"/>
+              <w:bottom w:type="dxa" w:w="80"/>
+              <w:right w:type="dxa" w:w="120"/>
+            </w:tcMar>
+          </w:tcPr>
+          <w:p>
+            <w:r>
+              <w:rPr>
+                <w:color w:val="1A1A1A"/>
+                <w:sz w:val="18"/>
+                <w:szCs w:val="18"/>
+              </w:rPr>
+              <w:t xml:space="preserve">Prior Auth Request + Denial Letter (TriCore Regional Health)</w:t>
+            </w:r>
+          </w:p>
+        </w:tc>
+        <w:tc>
+          <w:tcPr>
+            <w:tcW w:type="dxa" w:w="4200"/>
+            <w:tcMar>
+              <w:top w:type="dxa" w:w="80"/>
+              <w:left w:type="dxa" w:w="120"/>
+              <w:bottom w:type="dxa" w:w="80"/>
+              <w:right w:type="dxa" w:w="120"/>
+            </w:tcMar>
+          </w:tcPr>
+          <w:p>
+            <w:r>
+              <w:rPr>
+                <w:color w:val="1A1A1A"/>
+                <w:sz w:val="18"/>
+                <w:szCs w:val="18"/>
+              </w:rPr>
+              <w:t xml:space="preserve">Deliberately seeded: denial dated before the request, a billed-amount mismatch, a transposed provider NPI, and a 15-day appeal window that breaks the 180-day pattern used elsewhere.</w:t>
+            </w:r>
+          </w:p>
+        </w:tc>
+      </w:tr>
+      <w:tr>
+        <w:tc>
+          <w:tcPr>
+            <w:tcW w:type="dxa" w:w="2100"/>
+            <w:tcMar>
+              <w:top w:type="dxa" w:w="80"/>
+              <w:left w:type="dxa" w:w="120"/>
+              <w:bottom w:type="dxa" w:w="80"/>
+              <w:right w:type="dxa" w:w="120"/>
+            </w:tcMar>
+          </w:tcPr>
+          <w:p>
+            <w:r>
+              <w:rPr>
+                <w:color w:val="1A1A1A"/>
+                <w:sz w:val="18"/>
+                <w:szCs w:val="18"/>
+              </w:rPr>
+              <w:t xml:space="preserve">File6_Remittance_EOB_ANOMALY.pdf</w:t>
+            </w:r>
+          </w:p>
+        </w:tc>
+        <w:tc>
+          <w:tcPr>
+            <w:tcW w:type="dxa" w:w="3300"/>
+            <w:tcMar>
+              <w:top w:type="dxa" w:w="80"/>
+              <w:left w:type="dxa" w:w="120"/>
+              <w:bottom w:type="dxa" w:w="80"/>
+              <w:right w:type="dxa" w:w="120"/>
+            </w:tcMar>
+          </w:tcPr>
+          <w:p>
+            <w:r>
+              <w:rPr>
+                <w:color w:val="1A1A1A"/>
+                <w:sz w:val="18"/>
+                <w:szCs w:val="18"/>
+              </w:rPr>
+              <w:t xml:space="preserve">Remittance Advice + EOB (TriCore Regional Health)</w:t>
+            </w:r>
+          </w:p>
+        </w:tc>
+        <w:tc>
+          <w:tcPr>
+            <w:tcW w:type="dxa" w:w="4200"/>
+            <w:tcMar>
+              <w:top w:type="dxa" w:w="80"/>
+              <w:left w:type="dxa" w:w="120"/>
+              <w:bottom w:type="dxa" w:w="80"/>
+              <w:right w:type="dxa" w:w="120"/>
+            </w:tcMar>
+          </w:tcPr>
+          <w:p>
+            <w:r>
+              <w:rPr>
+                <w:color w:val="1A1A1A"/>
+                <w:sz w:val="18"/>
+                <w:szCs w:val="18"/>
+              </w:rPr>
+              <w:t xml:space="preserve">Deliberately seeded: a mismatched claim # between the ERA and EOB, an allowed amount that exceeds billed, a payment date before the date of service, and a ~$1,413.64 underpayment vs. the payer's own EOB figure.</w:t>
+            </w:r>
+          </w:p>
+        </w:tc>
+      </w:tr>
+    </w:tbl>
+    <w:p>
+      <w:pPr>
+        <w:spacing w:after="160"/>
+      </w:pPr>
+      <w:r>
+        <w:rPr>
+          <w:i w:val="false"/>
+          <w:iCs w:val="false"/>
+          <w:color w:val="1A1A1A"/>
+          <w:sz w:val="21"/>
+          <w:szCs w:val="21"/>
+        </w:rPr>
+        <w:t xml:space="preserve">html/healthcare/ANOMALY_ANSWER_KEY.md documents every seeded anomaly below in full, for scoring a detection workflow's output against ground truth.</w:t>
+      </w:r>
+    </w:p>
+    <w:tbl>
+      <w:tblPr>
+        <w:tblW w:type="dxa" w:w="9000"/>
+        <w:tblBorders>
+          <w:top w:val="single" w:color="auto" w:sz="4"/>
+          <w:left w:val="single" w:color="auto" w:sz="4"/>
+          <w:bottom w:val="single" w:color="auto" w:sz="4"/>
+          <w:right w:val="single" w:color="auto" w:sz="4"/>
+          <w:insideH w:val="single" w:color="auto" w:sz="4"/>
+          <w:insideV w:val="single" w:color="auto" w:sz="4"/>
+        </w:tblBorders>
+      </w:tblPr>
+      <w:tblGrid>
+        <w:gridCol w:w="9000"/>
+      </w:tblGrid>
+      <w:tr>
+        <w:tc>
+          <w:tcPr>
+            <w:tcW w:type="dxa" w:w="9000"/>
+            <w:tcBorders>
+              <w:top w:val="single" w:color="C0392B" w:sz="4"/>
+              <w:left w:val="single" w:color="C0392B" w:sz="4"/>
+              <w:bottom w:val="single" w:color="C0392B" w:sz="4"/>
+              <w:right w:val="single" w:color="C0392B" w:sz="4"/>
+            </w:tcBorders>
+            <w:shd w:fill="F2F4F7" w:val="clear"/>
+            <w:tcMar>
+              <w:top w:type="dxa" w:w="120"/>
+              <w:left w:type="dxa" w:w="160"/>
+              <w:bottom w:type="dxa" w:w="120"/>
+              <w:right w:type="dxa" w:w="160"/>
+            </w:tcMar>
+          </w:tcPr>
+          <w:p>
+            <w:pPr>
+              <w:spacing w:after="80"/>
+            </w:pPr>
+            <w:r>
+              <w:rPr>
+                <w:b/>
+                <w:bCs/>
+                <w:color w:val="C0392B"/>
+                <w:sz w:val="21"/>
+                <w:szCs w:val="21"/>
+              </w:rPr>
+              <w:t xml:space="preserve">Verified — End-to-End Test</w:t>
+            </w:r>
+          </w:p>
+          <w:p>
+            <w:r>
+              <w:rPr>
+                <w:color w:val="1A1A1A"/>
+                <w:sz w:val="20"/>
+                <w:szCs w:val="20"/>
+              </w:rPr>
+              <w:t xml:space="preserve">Two randomly-selected files from this set (File2_Remittance_EOB.pdf and File4_Remittance_EOB_2.pdf) were run through the real pipeline — routes/doc-router.js's pdf-parse extraction followed by server/healthcare/hc-neural-intake.js's classifyIntake() — and both extracted cleanly and classified correctly to the billing node at high confidence, matched on “claim”, “cpt”, “remit”, “era”, and “eob”.</w:t>
             </w:r>
           </w:p>
         </w:tc>

</xml_diff>